<commit_message>
Complete regex for extraction
</commit_message>
<xml_diff>
--- a/Regex Exercice 2.docx
+++ b/Regex Exercice 2.docx
@@ -606,43 +606,15 @@
           <w:highlight w:val="lightGray"/>
           <w:lang w:val="en-GB"/>
         </w:rPr>
-        <w:t xml:space="preserve"># </w:t>
-      </w:r>
-      <w:r>
-        <w:rPr>
-          <w:highlight w:val="lightGray"/>
-          <w:lang w:val="en-GB"/>
-        </w:rPr>
-        <w:t xml:space="preserve">dossiers </w:t>
-      </w:r>
-      <w:proofErr w:type="spellStart"/>
-      <w:r>
-        <w:rPr>
-          <w:highlight w:val="lightGray"/>
-          <w:lang w:val="en-GB"/>
-        </w:rPr>
-        <w:t>d’e</w:t>
-      </w:r>
-      <w:r>
-        <w:rPr>
-          <w:highlight w:val="lightGray"/>
-          <w:lang w:val="en-GB"/>
-        </w:rPr>
-        <w:t>nviron</w:t>
-      </w:r>
-      <w:r>
-        <w:rPr>
-          <w:highlight w:val="lightGray"/>
-          <w:lang w:val="en-GB"/>
-        </w:rPr>
-        <w:t>ne</w:t>
-      </w:r>
-      <w:r>
-        <w:rPr>
-          <w:highlight w:val="lightGray"/>
-          <w:lang w:val="en-GB"/>
-        </w:rPr>
-        <w:t>ment</w:t>
+        <w:t xml:space="preserve"># dossiers </w:t>
+      </w:r>
+      <w:proofErr w:type="spellStart"/>
+      <w:r>
+        <w:rPr>
+          <w:highlight w:val="lightGray"/>
+          <w:lang w:val="en-GB"/>
+        </w:rPr>
+        <w:t>d’environnement</w:t>
       </w:r>
       <w:proofErr w:type="spellEnd"/>
     </w:p>
@@ -1303,6 +1275,229 @@
           <w:lang w:val="en-GB"/>
         </w:rPr>
       </w:pPr>
+      <w:r>
+        <w:rPr>
+          <w:lang w:val="en-GB"/>
+        </w:rPr>
+        <w:t>r"\b(?P&lt;ip_1&gt;:25[0-5]|2[0-4]\d|1\d{2}|[1-9]?\d)\.(?P&lt;ip_2&gt;:25[0-5]|2[0-4]\d|1\d{2}|[1-9]?\d)\.(?P&lt;ip_3&gt;:25[0-5]|2[0-4]\d|1\d{2}|[1-9]?\d)\.(?P&lt;ip_4&gt;:25[0-5]|2[0-4]\d|1\d{2}|[1-9]?\d)\b\s(?P&lt;identd&gt;\S+)\s(?P&lt;user&gt;\S+)"gmu</w:t>
+      </w:r>
+      <w:r>
+        <w:rPr>
+          <w:lang w:val="en-GB"/>
+        </w:rPr>
+        <w:t>”</w:t>
+      </w:r>
+    </w:p>
+    <w:p>
+      <w:pPr>
+        <w:rPr>
+          <w:lang w:val="en-GB"/>
+        </w:rPr>
+      </w:pPr>
+      <w:r>
+        <w:rPr>
+          <w:lang w:val="en-GB"/>
+        </w:rPr>
+        <w:t>r"\b(?P&lt;ip_1&gt;:25[0-5]|2[0-4]\d|1\d{2}|[1-9]?\d)\.(?P&lt;ip_2&gt;:25[0-5]|2[0-4]\d|1\d{2}|[1-9]?\d)\.(?P&lt;ip_3&gt;:25[0-5]|2[0-4]\d|1\d{2}|[1-9]?\d)\.(?P&lt;ip_4&gt;:25[0-5]|2[0-4]\d|1\d{2}|[1-9]?\d)\b\s(?P&lt;identd&gt;\S+)\s(?P&lt;user&gt;\S+)\s(?P&lt;raw_timestamp&gt;\[(.+?)\])"gmu</w:t>
+      </w:r>
+      <w:r>
+        <w:rPr>
+          <w:lang w:val="en-GB"/>
+        </w:rPr>
+        <w:t>”</w:t>
+      </w:r>
+    </w:p>
+    <w:p>
+      <w:pPr>
+        <w:rPr>
+          <w:lang w:val="en-GB"/>
+        </w:rPr>
+      </w:pPr>
+      <w:r>
+        <w:rPr>
+          <w:lang w:val="en-GB"/>
+        </w:rPr>
+        <w:t>r"\b(?P&lt;ip_1&gt;:25[0-5]|2[0-4]\d|1\d{2}|[1-9]?\d)\.(?P&lt;ip_2&gt;:25[0-5]|2[0-4]\d|1\d{2}|[1-9]?\d)\.(?P&lt;ip_3&gt;:25[0-5]|2[0-4]\d|1\d{2}|[1-9]?\d)\.(?P&lt;ip_4&gt;:25[0-5]|2[0-4]\d|1\d{2}|[1-9]?\d)\b\s(?P&lt;identd&gt;\S+)\s(?P&lt;user&gt;\S+)\s(?P&lt;raw_timestamp&gt;\[(.+?)\])\s\"(?P&lt;method&gt;\S+)"gmu</w:t>
+      </w:r>
+      <w:r>
+        <w:rPr>
+          <w:lang w:val="en-GB"/>
+        </w:rPr>
+        <w:t>”</w:t>
+      </w:r>
+    </w:p>
+    <w:p>
+      <w:pPr>
+        <w:rPr>
+          <w:lang w:val="en-GB"/>
+        </w:rPr>
+      </w:pPr>
+      <w:r>
+        <w:rPr>
+          <w:lang w:val="en-GB"/>
+        </w:rPr>
+        <w:t>r"\b(?P&lt;ip_1&gt;:25[0-5]|2[0-4]\d|1\d{2}|[1-9]?\d)\.(?P&lt;ip_2&gt;:25[0-5]|2[0-4]\d|1\d{2}|[1-9]?\d)\.(?P&lt;ip_3&gt;:25[0-5]|2[0-4]\d|1\d{2}|[1-9]?\d)\.(?P&lt;ip_4&gt;:25[0-5]|2[0-4]\d|1\d{2}|[1-9]?\d)\b\s(?P&lt;identd&gt;\S+)\s(?P&lt;user&gt;\S+)\s\[(?P&lt;raw_timestamp&gt;.+?)\]\s\"(?P&lt;method&gt;\S+)"gmu</w:t>
+      </w:r>
+      <w:r>
+        <w:rPr>
+          <w:lang w:val="en-GB"/>
+        </w:rPr>
+        <w:t>”</w:t>
+      </w:r>
+    </w:p>
+    <w:p>
+      <w:pPr>
+        <w:rPr>
+          <w:lang w:val="en-GB"/>
+        </w:rPr>
+      </w:pPr>
+      <w:r>
+        <w:rPr>
+          <w:lang w:val="en-GB"/>
+        </w:rPr>
+        <w:t>r"\b(?P&lt;ip_1&gt;:25[0-5]|2[0-4]\d|1\d{2}|[1-9]?\d)\.(?P&lt;ip_2&gt;:25[0-5]|2[0-4]\d|1\d{2}|[1-9]?\d)\.(?P&lt;ip_3&gt;:25[0-5]|2[0-4]\d|1\d{2}|[1-9]?\d)\.(?P&lt;ip_4&gt;:25[0-5]|2[0-4]\d|1\d{2}|[1-9]?\d)\b\s(?P&lt;identd&gt;\S+)\s(?P&lt;user&gt;\S+)\s\[(?P&lt;raw_timestamp&gt;.+?)\]\s\"(?P&lt;method&gt;\S+)\s(?P&lt;URL&gt;\S+)"gmu</w:t>
+      </w:r>
+      <w:r>
+        <w:rPr>
+          <w:lang w:val="en-GB"/>
+        </w:rPr>
+        <w:t>”</w:t>
+      </w:r>
+    </w:p>
+    <w:p>
+      <w:pPr>
+        <w:rPr>
+          <w:lang w:val="en-GB"/>
+        </w:rPr>
+      </w:pPr>
+      <w:r>
+        <w:rPr>
+          <w:lang w:val="en-GB"/>
+        </w:rPr>
+        <w:t>r"\b(?P&lt;ip_1&gt;:25[0-5]|2[0-4]\d|1\d{2}|[1-9]?\d)\.(?P&lt;ip_2&gt;:25[0-5]|2[0-4]\d|1\d{2}|[1-9]?\d)\.(?P&lt;ip_3&gt;:25[0-5]|2[0-4]\d|1\d{2}|[1-9]?\d)\.(?P&lt;ip_4&gt;:25[0-5]|2[0-4]\d|1\d{2}|[1-9]?\d)\b\s(?P&lt;identd&gt;\S+)\s(?P&lt;user&gt;\S+)\s\[(?P&lt;raw_timestamp&gt;.+?)\]\s\"(?P&lt;method&gt;\S+)\s(?P&lt;URL&gt;\S+)\s(?P&lt;protocol&gt;\S+\")"gmu</w:t>
+      </w:r>
+      <w:r>
+        <w:rPr>
+          <w:lang w:val="en-GB"/>
+        </w:rPr>
+        <w:t>”</w:t>
+      </w:r>
+    </w:p>
+    <w:p>
+      <w:pPr>
+        <w:rPr>
+          <w:lang w:val="en-GB"/>
+        </w:rPr>
+      </w:pPr>
+    </w:p>
+    <w:p>
+      <w:pPr>
+        <w:rPr>
+          <w:lang w:val="en-GB"/>
+        </w:rPr>
+      </w:pPr>
+      <w:r>
+        <w:rPr>
+          <w:lang w:val="en-GB"/>
+        </w:rPr>
+        <w:t>r"\b(?P&lt;ip_1&gt;:25[0-5]|2[0-4]\d|1\d{2}|[1-9]?\d)\.(?P&lt;ip_2&gt;:25[0-5]|2[0-4]\d|1\d{2}|[1-9]?\d)\.(?P&lt;ip_3&gt;:25[0-5]|2[0-4]\d|1\d{2}|[1-9]?\d)\.(?P&lt;ip_4&gt;:25[0-5]|2[0-4]\d|1\d{2}|[1-</w:t>
+      </w:r>
+      <w:r>
+        <w:rPr>
+          <w:lang w:val="en-GB"/>
+        </w:rPr>
+        <w:lastRenderedPageBreak/>
+        <w:t>9]?\d)\b\s(?P&lt;identd&gt;\S+)\s(?P&lt;user&gt;\S+)\s\[(?P&lt;raw_timestamp&gt;.+?)\]\s\"(?P&lt;method&gt;\S+)\s(?P&lt;URL&gt;\S+)\s(?P&lt;protocol&gt;[^\"\s]+)"gmu</w:t>
+      </w:r>
+      <w:r>
+        <w:rPr>
+          <w:lang w:val="en-GB"/>
+        </w:rPr>
+        <w:t>”</w:t>
+      </w:r>
+    </w:p>
+    <w:p>
+      <w:pPr>
+        <w:rPr>
+          <w:lang w:val="en-GB"/>
+        </w:rPr>
+      </w:pPr>
+    </w:p>
+    <w:p>
+      <w:pPr>
+        <w:rPr>
+          <w:lang w:val="en-GB"/>
+        </w:rPr>
+      </w:pPr>
+      <w:r>
+        <w:rPr>
+          <w:lang w:val="en-GB"/>
+        </w:rPr>
+        <w:t>r"\b(?P&lt;ip_1&gt;:25[0-5]|2[0-4]\d|1\d{2}|[1-9]?\d)\.(?P&lt;ip_2&gt;:25[0-5]|2[0-4]\d|1\d{2}|[1-9]?\d)\.(?P&lt;ip_3&gt;:25[0-5]|2[0-4]\d|1\d{2}|[1-9]?\d)\.(?P&lt;ip_4&gt;:25[0-5]|2[0-4]\d|1\d{2}|[1-9]?\d)\b\s(?P&lt;identd&gt;\S+)\s(?P&lt;user&gt;\S+)\s\[(?P&lt;raw_timestamp&gt;.+?)\]\s\"(?P&lt;method&gt;\S+)\s(?P&lt;URL&gt;\S+)\s(?P&lt;protocol&gt;[^\"\s]+)\"\s(?P&lt;status_code&gt;\d{3})"gmu</w:t>
+      </w:r>
+      <w:r>
+        <w:rPr>
+          <w:lang w:val="en-GB"/>
+        </w:rPr>
+        <w:t>”</w:t>
+      </w:r>
+    </w:p>
+    <w:p>
+      <w:pPr>
+        <w:rPr>
+          <w:lang w:val="en-GB"/>
+        </w:rPr>
+      </w:pPr>
+      <w:r>
+        <w:rPr>
+          <w:lang w:val="en-GB"/>
+        </w:rPr>
+        <w:t>r"\b(?P&lt;ip_1&gt;:25[0-5]|2[0-4]\d|1\d{2}|[1-9]?\d)\.(?P&lt;ip_2&gt;:25[0-5]|2[0-4]\d|1\d{2}|[1-9]?\d)\.(?P&lt;ip_3&gt;:25[0-5]|2[0-4]\d|1\d{2}|[1-9]?\d)\.(?P&lt;ip_4&gt;:25[0-5]|2[0-4]\d|1\d{2}|[1-9]?\d)\b\s(?P&lt;identd&gt;\S+)\s(?P&lt;user&gt;\S+)\s\[(?P&lt;raw_timestamp&gt;.+?)\]\s\"(?P&lt;method&gt;\S+)\s(?P&lt;URL&gt;\S+)\s(?P&lt;protocol&gt;[^\"\s]+)\"\s(?P&lt;status_code&gt;\d{3})\s(?P&lt;size&gt;\d+|-)"gmu</w:t>
+      </w:r>
+      <w:r>
+        <w:rPr>
+          <w:lang w:val="en-GB"/>
+        </w:rPr>
+        <w:t>”</w:t>
+      </w:r>
+    </w:p>
+    <w:p>
+      <w:pPr>
+        <w:rPr>
+          <w:lang w:val="en-GB"/>
+        </w:rPr>
+      </w:pPr>
+      <w:r>
+        <w:rPr>
+          <w:lang w:val="en-GB"/>
+        </w:rPr>
+        <w:t>r"\b(?P&lt;ip_1&gt;:25[0-5]|2[0-4]\d|1\d{2}|[1-9]?\d)\.(?P&lt;ip_2&gt;:25[0-5]|2[0-4]\d|1\d{2}|[1-9]?\d)\.(?P&lt;ip_3&gt;:25[0-5]|2[0-4]\d|1\d{2}|[1-9]?\d)\.(?P&lt;ip_4&gt;:25[0-5]|2[0-4]\d|1\d{2}|[1-9]?\d)\b\s(?P&lt;identd&gt;\S+)\s(?P&lt;user&gt;\S+)\s\[(?P&lt;raw_timestamp&gt;.+?)\]\s\"(?P&lt;method&gt;\S+)\s(?P&lt;URL&gt;\S+)\s(?P&lt;protocol&gt;[^\"\s]+)\"\s(?P&lt;status_code&gt;\d{3})\s(?P&lt;size&gt;\d+|-)\s\"(?P&lt;referrer&gt;[^\"\s]+)\"\s"gmu</w:t>
+      </w:r>
+      <w:r>
+        <w:rPr>
+          <w:lang w:val="en-GB"/>
+        </w:rPr>
+        <w:t>”</w:t>
+      </w:r>
+    </w:p>
+    <w:p>
+      <w:pPr>
+        <w:rPr>
+          <w:lang w:val="en-GB"/>
+        </w:rPr>
+      </w:pPr>
+      <w:r>
+        <w:rPr>
+          <w:lang w:val="en-GB"/>
+        </w:rPr>
+        <w:t>r"\b(?P&lt;ip_1&gt;:25[0-5]|2[0-4]\d|1\d{2}|[1-9]?\d)\.(?P&lt;ip_2&gt;:25[0-5]|2[0-4]\d|1\d{2}|[1-9]?\d)\.(?P&lt;ip_3&gt;:25[0-5]|2[0-4]\d|1\d{2}|[1-9]?\d)\.(?P&lt;ip_4&gt;:25[0-5]|2[0-4]\d|1\d{2}|[1-9]?\d)\b\s(?P&lt;identd&gt;\S+)\s(?P&lt;user&gt;\S+)\s\[(?P&lt;raw_timestamp&gt;.+?)\]\s\"(?P&lt;method&gt;\S+)\s(?P&lt;URL&gt;\S+)\s(?P&lt;protocol&gt;[^\"\s]+)\"\s(?P&lt;status_code&gt;\d{3})\s(?P&lt;size&gt;\d+|-)\s\"(?P&lt;referrer&gt;[^\"\s]+)\"\s\"(?P&lt;user_agent&gt;[^\"\s]+)"gmu</w:t>
+      </w:r>
+      <w:r>
+        <w:rPr>
+          <w:lang w:val="en-GB"/>
+        </w:rPr>
+        <w:t>”</w:t>
+      </w:r>
     </w:p>
     <w:p>
       <w:pPr>
@@ -1427,6 +1622,7 @@
         <w:rPr>
           <w:lang w:val="en-GB"/>
         </w:rPr>
+        <w:lastRenderedPageBreak/>
         <w:t># Replace the groups inside the parentheses () to match your log structure</w:t>
       </w:r>
     </w:p>
@@ -2096,6 +2292,7 @@
         <w:rPr>
           <w:lang w:val="en-GB"/>
         </w:rPr>
+        <w:lastRenderedPageBreak/>
         <w:t xml:space="preserve">        ) </w:t>
       </w:r>
       <w:proofErr w:type="gramStart"/>
@@ -3167,6 +3364,7 @@
   <w:style w:type="character" w:default="1" w:styleId="DefaultParagraphFont">
     <w:name w:val="Default Paragraph Font"/>
     <w:uiPriority w:val="1"/>
+    <w:semiHidden/>
     <w:unhideWhenUsed/>
   </w:style>
   <w:style w:type="table" w:default="1" w:styleId="TableNormal">

</xml_diff>